<commit_message>
Corrected pressure reading to continue during turbo start wait
</commit_message>
<xml_diff>
--- a/Lakeshore Cryostation User Guide.docx
+++ b/Lakeshore Cryostation User Guide.docx
@@ -181,12 +181,21 @@
           <w:szCs w:val="40"/>
         </w:rPr>
       </w:pPr>
-      <w:r>
-        <w:rPr>
-          <w:sz w:val="40"/>
-          <w:szCs w:val="40"/>
-        </w:rPr>
-        <w:t>Koustav Jana</w:t>
+      <w:proofErr w:type="spellStart"/>
+      <w:r>
+        <w:rPr>
+          <w:sz w:val="40"/>
+          <w:szCs w:val="40"/>
+        </w:rPr>
+        <w:t>Koustav</w:t>
+      </w:r>
+      <w:proofErr w:type="spellEnd"/>
+      <w:r>
+        <w:rPr>
+          <w:sz w:val="40"/>
+          <w:szCs w:val="40"/>
+        </w:rPr>
+        <w:t xml:space="preserve"> Jana</w:t>
       </w:r>
       <w:r>
         <w:rPr>
@@ -263,12 +272,21 @@
           <w:szCs w:val="40"/>
         </w:rPr>
       </w:pPr>
-      <w:r>
-        <w:rPr>
-          <w:sz w:val="40"/>
-          <w:szCs w:val="40"/>
-        </w:rPr>
-        <w:t xml:space="preserve">Zhengliang Bian </w:t>
+      <w:proofErr w:type="spellStart"/>
+      <w:r>
+        <w:rPr>
+          <w:sz w:val="40"/>
+          <w:szCs w:val="40"/>
+        </w:rPr>
+        <w:t>Zhengliang</w:t>
+      </w:r>
+      <w:proofErr w:type="spellEnd"/>
+      <w:r>
+        <w:rPr>
+          <w:sz w:val="40"/>
+          <w:szCs w:val="40"/>
+        </w:rPr>
+        <w:t xml:space="preserve"> Bian </w:t>
       </w:r>
       <w:r>
         <w:rPr>
@@ -368,7 +386,15 @@
         <w:spacing w:after="0"/>
       </w:pPr>
       <w:r>
-        <w:t>Close the pumptrain isolation valve by turning clockwise.</w:t>
+        <w:t xml:space="preserve">Close the </w:t>
+      </w:r>
+      <w:proofErr w:type="spellStart"/>
+      <w:r>
+        <w:t>pumptrain</w:t>
+      </w:r>
+      <w:proofErr w:type="spellEnd"/>
+      <w:r>
+        <w:t xml:space="preserve"> isolation valve by turning clockwise.</w:t>
       </w:r>
     </w:p>
     <w:p>
@@ -442,7 +468,23 @@
         <w:spacing w:after="0"/>
       </w:pPr>
       <w:r>
-        <w:t>Turn on the N2 line counter-clockwise. Wait a minute or so until the chamber is at atmosphere. Keep N2 flowing while lid is open.</w:t>
+        <w:t xml:space="preserve">Turn on the N2 line </w:t>
+      </w:r>
+      <w:proofErr w:type="gramStart"/>
+      <w:r>
+        <w:t>counter-clockwise</w:t>
+      </w:r>
+      <w:proofErr w:type="gramEnd"/>
+      <w:r>
+        <w:t xml:space="preserve">. Wait a minute or so until the chamber is </w:t>
+      </w:r>
+      <w:proofErr w:type="gramStart"/>
+      <w:r>
+        <w:t>at atmosphere</w:t>
+      </w:r>
+      <w:proofErr w:type="gramEnd"/>
+      <w:r>
+        <w:t>. Keep N2 flowing while lid is open.</w:t>
       </w:r>
     </w:p>
     <w:p>
@@ -468,7 +510,15 @@
         <w:spacing w:after="0"/>
       </w:pPr>
       <w:r>
-        <w:t>Load sample. Check that sample will be in field of view of microscope and that focus is in range.</w:t>
+        <w:t xml:space="preserve">Load sample. Check that sample will be in field of view of microscope and that focus is </w:t>
+      </w:r>
+      <w:proofErr w:type="gramStart"/>
+      <w:r>
+        <w:t>in</w:t>
+      </w:r>
+      <w:proofErr w:type="gramEnd"/>
+      <w:r>
+        <w:t xml:space="preserve"> range.</w:t>
       </w:r>
     </w:p>
     <w:p>
@@ -481,7 +531,15 @@
         <w:spacing w:after="0"/>
       </w:pPr>
       <w:r>
-        <w:t xml:space="preserve">Move in probe arms that you will use. Move them close to where you want to probe, but give them space so they can move during pump down and cool down process. </w:t>
+        <w:t xml:space="preserve">Move in probe arms that you will use. Move them close to where you want to </w:t>
+      </w:r>
+      <w:proofErr w:type="gramStart"/>
+      <w:r>
+        <w:t>probe, but</w:t>
+      </w:r>
+      <w:proofErr w:type="gramEnd"/>
+      <w:r>
+        <w:t xml:space="preserve"> give them space so they can move during pump down and cool down process. </w:t>
       </w:r>
     </w:p>
     <w:p>
@@ -533,13 +591,7 @@
         <w:spacing w:after="0"/>
       </w:pPr>
       <w:r>
-        <w:t>Check the speed of the turbo in the software GUI.</w:t>
-      </w:r>
-      <w:r>
-        <w:t xml:space="preserve"> </w:t>
-      </w:r>
-      <w:r>
-        <w:t>If the turbo speed Is still &gt;35000 rpm, wait until it drops below 35000 rpm.</w:t>
+        <w:t>Check the speed of the turbo in the software GUI. If the turbo speed Is still &gt;35000 rpm, wait until it drops below 35000 rpm.</w:t>
       </w:r>
     </w:p>
     <w:p>
@@ -675,7 +727,15 @@
         <w:spacing w:after="0"/>
       </w:pPr>
       <w:r>
-        <w:t xml:space="preserve">Open the pumptrain isolation valve by turning </w:t>
+        <w:t xml:space="preserve">Open the </w:t>
+      </w:r>
+      <w:proofErr w:type="spellStart"/>
+      <w:r>
+        <w:t>pumptrain</w:t>
+      </w:r>
+      <w:proofErr w:type="spellEnd"/>
+      <w:r>
+        <w:t xml:space="preserve"> isolation valve by turning </w:t>
       </w:r>
       <w:r>
         <w:t>CCW</w:t>
@@ -747,13 +807,22 @@
       </w:pPr>
       <w:r>
         <w:lastRenderedPageBreak/>
-        <w:t>Turn on the pump</w:t>
-      </w:r>
-      <w:r>
-        <w:t xml:space="preserve"> with the GUI</w:t>
-      </w:r>
-      <w:r>
-        <w:t xml:space="preserve">. Monitor the pressure on the GUI. It should reach &lt;1e-3 Torr within a few minutes. </w:t>
+        <w:t>P</w:t>
+      </w:r>
+      <w:r>
+        <w:t xml:space="preserve">lug in the D-sub connector into the J6 connection to the left of the RS232 cable on the back of the pump. The D-sub connector shorts the scroll pump </w:t>
+      </w:r>
+      <w:r>
+        <w:t xml:space="preserve">power supply </w:t>
+      </w:r>
+      <w:r>
+        <w:t>so that it w</w:t>
+      </w:r>
+      <w:r>
+        <w:t>ill maintain base pressure during measurement</w:t>
+      </w:r>
+      <w:r>
+        <w:t>.</w:t>
       </w:r>
     </w:p>
     <w:p>
@@ -766,25 +835,7 @@
         <w:spacing w:after="0"/>
       </w:pPr>
       <w:r>
-        <w:t>P</w:t>
-      </w:r>
-      <w:r>
-        <w:t xml:space="preserve">lug in the D-sub connector into the J6 connection to the left of the RS232 cable on the back of the pump. </w:t>
-      </w:r>
-      <w:r>
-        <w:t xml:space="preserve">The D-sub connector shorts the scroll pump </w:t>
-      </w:r>
-      <w:r>
-        <w:t xml:space="preserve">power supply </w:t>
-      </w:r>
-      <w:r>
-        <w:t>so that it w</w:t>
-      </w:r>
-      <w:r>
-        <w:t>ill maintain base pressure during measurement</w:t>
-      </w:r>
-      <w:r>
-        <w:t>.</w:t>
+        <w:t xml:space="preserve">Turn on the pump with the GUI. Monitor the pressure on the GUI. It should reach &lt;1e-3 Torr within a few minutes. </w:t>
       </w:r>
     </w:p>
     <w:sectPr>

</xml_diff>